<commit_message>
feat: forgot-password email flow, multi-audience event forwarding, glass on every panel
One-shot 30-min reset tokens emailed (console-logged without SMTP) +
reset-password.html; event audience is a validated comma list and any
recipient forwards to role-scoped reachables as notifications; fixed
/notifications being platform-gated (school roles' bell was dead);
light-theme cards/stats now read the --glass-* tokens (no flat panels).
</commit_message>
<xml_diff>
--- a/docs/School Management Software.docx
+++ b/docs/School Management Software.docx
@@ -274,7 +274,7 @@
         <w:rPr>
           <w:sz w:val="22"/>
         </w:rPr>
-        <w:t>12. Implementation Status</w:t>
+        <w:t>12. Dependencies Used</w:t>
       </w:r>
     </w:p>
     <w:p>
@@ -285,7 +285,18 @@
         <w:rPr>
           <w:sz w:val="22"/>
         </w:rPr>
-        <w:t>13. Conclusion</w:t>
+        <w:t>13. Implementation Status</w:t>
+      </w:r>
+    </w:p>
+    <w:p>
+      <w:pPr>
+        <w:spacing w:after="40"/>
+      </w:pPr>
+      <w:r>
+        <w:rPr>
+          <w:sz w:val="22"/>
+        </w:rPr>
+        <w:t>14. Conclusion</w:t>
       </w:r>
     </w:p>
     <w:p>
@@ -351,12 +362,7 @@
     </w:p>
     <w:p>
       <w:r>
-        <w:t>When a developer hardcodes "Class" as a table name, they have built an application for one type of school. When they model "Cohort" as an entity and allow the tenant to label it "Class," "Section," or "Batch," they have built a configurable system. This is the distinction between a single-school application and a platform.</w:t>
-      </w:r>
-    </w:p>
-    <w:p>
-      <w:r>
-        <w:t>This document is the technical foundation of the SchoolHub project. It defines the fourteen universal primitives, explains the three that are critical to getting the design right, establishes the scope boundaries that keep the project achievable, and maps each primitive to its implementation in the codebase.</w:t>
+        <w:t>When a developer hardcodes "Class" as a table name, they have built an application for one type of school. When they model "Cohort" as an entity and allow the tenant to label it, they have built a configurable system. This is the distinction between a single-school application and a platform.</w:t>
       </w:r>
     </w:p>
     <w:p>
@@ -374,7 +380,7 @@
     </w:p>
     <w:p>
       <w:r>
-        <w:t>The following table presents the complete vocabulary. Every learning institution on record can be described with these fourteen concepts. The skill is in how they are connected.</w:t>
+        <w:t>The following table presents the complete vocabulary. Every learning institution on record can be described with these fourteen concepts.</w:t>
       </w:r>
     </w:p>
     <w:tbl>
@@ -1495,7 +1501,7 @@
     <w:p/>
     <w:p>
       <w:r>
-        <w:t>Common labels: student, pupil, learner, trainee; teacher, lecturer, tutor; guardian, parent; admin, registrar</w:t>
+        <w:t>Common labels: student, pupil, learner; teacher, lecturer; guardian, parent; admin, registrar</w:t>
       </w:r>
     </w:p>
     <w:p>
@@ -1512,7 +1518,7 @@
         <w:t xml:space="preserve">Design rationale: </w:t>
       </w:r>
       <w:r>
-        <w:t>The amateur approach creates separate tables for Student, Teacher, and Guardian. The professional approach uses one Person table with roles assigned through a join table. This allows a single individual to hold multiple roles across multiple institutions without duplication or schema contradiction.</w:t>
+        <w:t>The amateur approach creates separate tables for Student, Teacher, and Guardian. The professional approach uses one Person table with roles assigned through a join table. A single individual can hold multiple roles across multiple institutions without duplication.</w:t>
       </w:r>
     </w:p>
     <w:p>
@@ -1520,7 +1526,7 @@
         <w:pStyle w:val="ListBullet"/>
       </w:pPr>
       <w:r>
-        <w:t>A single platform.app_user row can be linked to teacher, student, and guardian profiles across different schools.</w:t>
+        <w:t>A single platform.app_user row links to teacher, student, and guardian profiles across schools.</w:t>
       </w:r>
     </w:p>
     <w:p>
@@ -1528,7 +1534,7 @@
         <w:pStyle w:val="ListBullet"/>
       </w:pPr>
       <w:r>
-        <w:t>The avatar (profile picture) is stored on app_user and follows the person across all their tenant memberships.</w:t>
+        <w:t>The avatar is stored on app_user and follows the person across all tenant memberships.</w:t>
       </w:r>
     </w:p>
     <w:p>
@@ -1536,7 +1542,7 @@
         <w:pStyle w:val="ListBullet"/>
       </w:pPr>
       <w:r>
-        <w:t>Role assignments are per-tenant: a person can be an Admin at one school and a Teacher at another simultaneously.</w:t>
+        <w:t>Role assignments are per-tenant: a person can be an Admin at one school and a Teacher at another.</w:t>
       </w:r>
     </w:p>
     <w:p/>
@@ -1578,7 +1584,7 @@
         <w:t xml:space="preserve">Design rationale: </w:t>
       </w:r>
       <w:r>
-        <w:t>The role_assignment table is the authoritative source for what roles a user holds. The legacy app_user.role_id column remains as a fallback. A user may hold multiple role assignments across multiple tenants. The is_default flag on each assignment determines which one is used to mint the JWT at login.</w:t>
+        <w:t>The role_assignment table is the authoritative source for what roles a user holds. A user may hold multiple role assignments across multiple tenants. The is_default flag determines which assignment mints the JWT at login.</w:t>
       </w:r>
     </w:p>
     <w:p>
@@ -1586,7 +1592,7 @@
         <w:pStyle w:val="ListBullet"/>
       </w:pPr>
       <w:r>
-        <w:t>PLATFORM_OWNER (id=1): Operates SchoolHub itself. Not associated with any single school.</w:t>
+        <w:t>PLATFORM_OWNER (id=1): Operates SchoolHub itself.</w:t>
       </w:r>
     </w:p>
     <w:p>
@@ -1594,7 +1600,7 @@
         <w:pStyle w:val="ListBullet"/>
       </w:pPr>
       <w:r>
-        <w:t>MODERATOR (id=2): Platform support staff. Reviews and manages schools across the platform.</w:t>
+        <w:t>MODERATOR (id=2): Platform support staff.</w:t>
       </w:r>
     </w:p>
     <w:p>
@@ -1602,7 +1608,7 @@
         <w:pStyle w:val="ListBullet"/>
       </w:pPr>
       <w:r>
-        <w:t>ADMIN (id=3): Manages one school. Created automatically when the school registers.</w:t>
+        <w:t>ADMIN (id=3): Manages one school.</w:t>
       </w:r>
     </w:p>
     <w:p>
@@ -1610,7 +1616,7 @@
         <w:pStyle w:val="ListBullet"/>
       </w:pPr>
       <w:r>
-        <w:t>PRINCIPAL (id=4): Senior staff with administrator-equivalent access.</w:t>
+        <w:t>PRINCIPAL (id=4): Senior staff with admin-equivalent access.</w:t>
       </w:r>
     </w:p>
     <w:p>
@@ -1618,7 +1624,7 @@
         <w:pStyle w:val="ListBullet"/>
       </w:pPr>
       <w:r>
-        <w:t>TEACHER (id=5): Records attendance and enters grades for assigned classes.</w:t>
+        <w:t>TEACHER (id=5): Records attendance and enters grades.</w:t>
       </w:r>
     </w:p>
     <w:p>
@@ -1626,7 +1632,7 @@
         <w:pStyle w:val="ListBullet"/>
       </w:pPr>
       <w:r>
-        <w:t>STUDENT (id=6): Views personal results, timetable, and fees.</w:t>
+        <w:t>STUDENT (id=6): Views personal results and fees.</w:t>
       </w:r>
     </w:p>
     <w:p>
@@ -1634,7 +1640,7 @@
         <w:pStyle w:val="ListBullet"/>
       </w:pPr>
       <w:r>
-        <w:t>PARENT (id=7): Monitors academic progress and manages payments for linked children.</w:t>
+        <w:t>PARENT (id=7): Monitors progress for linked children.</w:t>
       </w:r>
     </w:p>
     <w:p>
@@ -1642,7 +1648,7 @@
         <w:pStyle w:val="ListBullet"/>
       </w:pPr>
       <w:r>
-        <w:t>BURSAR (id=8): Manages invoices, records payments, and handles financial operations.</w:t>
+        <w:t>BURSAR (id=8): Manages invoices and payments.</w:t>
       </w:r>
     </w:p>
     <w:p>
@@ -1650,7 +1656,7 @@
         <w:pStyle w:val="ListBullet"/>
       </w:pPr>
       <w:r>
-        <w:t>LIBRARIAN (id=9): Manages the library catalogue, approves borrowing requests, and escalates issues.</w:t>
+        <w:t>LIBRARIAN (id=9): Manages the library catalogue.</w:t>
       </w:r>
     </w:p>
     <w:p/>
@@ -1682,18 +1688,18 @@
           <w:color w:val="3B82F6"/>
           <w:sz w:val="22"/>
         </w:rPr>
-        <w:t>A recursive structural container. Institution to Campus to Faculty to Department, with unlimited nesting depth.</w:t>
+        <w:t>A recursive structural container with unlimited nesting depth.</w:t>
       </w:r>
     </w:p>
     <w:p/>
     <w:p>
       <w:r>
-        <w:t>Common labels: institution, campus, school, faculty, department, division</w:t>
+        <w:t>Common labels: institution, campus, school, faculty, department</w:t>
       </w:r>
     </w:p>
     <w:p>
       <w:r>
-        <w:t>SchoolHub implementation: org_unit (self-referential via parent_id)</w:t>
+        <w:t>SchoolHub implementation: org_unit (self-ref via parent_id)</w:t>
       </w:r>
     </w:p>
     <w:p/>
@@ -1705,7 +1711,7 @@
         <w:t xml:space="preserve">Design rationale: </w:t>
       </w:r>
       <w:r>
-        <w:t>Self-referential design supports arbitrary depth without schema changes. A university with four levels of hierarchy and a single-campus primary school with one level use the same table. Type labels are freeform text fields rather than a database enum, so the application layer can suggest presets without constraining the data.</w:t>
+        <w:t>Self-referential design supports arbitrary depth without schema changes. Type labels are freeform text fields rather than a database enum.</w:t>
       </w:r>
     </w:p>
     <w:p>
@@ -1713,7 +1719,7 @@
         <w:pStyle w:val="ListBullet"/>
       </w:pPr>
       <w:r>
-        <w:t>Deletion is governed by a workflow: marking a unit as pending_deletion opens a seven-day protest window.</w:t>
+        <w:t>Deletion is governed by workflow: marking a unit pending_deletion opens a seven-day protest window.</w:t>
       </w:r>
     </w:p>
     <w:p>
@@ -1721,7 +1727,7 @@
         <w:pStyle w:val="ListBullet"/>
       </w:pPr>
       <w:r>
-        <w:t>Status values: active or pending_deletion. The flag is visible everywhere immediately upon proposal.</w:t>
+        <w:t>Status: active or pending_deletion.</w:t>
       </w:r>
     </w:p>
     <w:p/>
@@ -1746,12 +1752,12 @@
     <w:p/>
     <w:p>
       <w:r>
-        <w:t>Common labels: course, subject, module, unit, program, track, curriculum</w:t>
+        <w:t>Common labels: course, subject, module, unit, program, track</w:t>
       </w:r>
     </w:p>
     <w:p>
       <w:r>
-        <w:t>SchoolHub implementation: offering (self-referential) + offering_org_unit + offering_prerequisite</w:t>
+        <w:t>SchoolHub implementation: offering (self-ref) + offering_org_unit + offering_prerequisite</w:t>
       </w:r>
     </w:p>
     <w:p/>
@@ -1763,7 +1769,7 @@
         <w:t xml:space="preserve">Design rationale: </w:t>
       </w:r>
       <w:r>
-        <w:t>Mirrors the recursive pattern of organizational units. A "BSc Computer Science" is an offering with children such as "CS101" and "CS201." Cross-listing through offering_org_unit allows one offering to belong to multiple organizational units simultaneously. Prerequisites are configurable per offering.</w:t>
+        <w:t>Mirrors the recursive pattern of organizational units. Cross-listing through offering_org_unit allows one offering to belong to multiple departments.</w:t>
       </w:r>
     </w:p>
     <w:p>
@@ -1771,7 +1777,7 @@
         <w:pStyle w:val="ListBullet"/>
       </w:pPr>
       <w:r>
-        <w:t>credit_weight: a numeric field distinguishing a 3-credit course from a 1-credit lab module.</w:t>
+        <w:t>credit_weight distinguishes a 3-credit course from a 1-credit lab.</w:t>
       </w:r>
     </w:p>
     <w:p>
@@ -1779,7 +1785,7 @@
         <w:pStyle w:val="ListBullet"/>
       </w:pPr>
       <w:r>
-        <w:t>Together, Organizational Unit and Offering answer the question: who teaches what, and where?</w:t>
+        <w:t>Together, Org Unit and Offering answer: who teaches what, and where?</w:t>
       </w:r>
     </w:p>
     <w:p/>
@@ -1811,13 +1817,13 @@
           <w:color w:val="3B82F6"/>
           <w:sz w:val="22"/>
         </w:rPr>
-        <w:t>How learners are bundled together. Recreated every schedule period rather than persisting across years.</w:t>
+        <w:t>How learners are bundled. Recreated every schedule period.</w:t>
       </w:r>
     </w:p>
     <w:p/>
     <w:p>
       <w:r>
-        <w:t>Common labels: class, section, batch, stream, form, set, division</w:t>
+        <w:t>Common labels: class, section, batch, stream, form</w:t>
       </w:r>
     </w:p>
     <w:p>
@@ -1834,7 +1840,7 @@
         <w:t xml:space="preserve">Design rationale: </w:t>
       </w:r>
       <w:r>
-        <w:t>A cohort is flat: it never nests inside another cohort. The continuity of "SS2A becomes SS3A next year" is tracked through enrollment history, not by persisting the cohort row. Groups nest inside cohorts for informal sub-teams or to indicate which students take a particular offering.</w:t>
+        <w:t>A cohort is flat: it never nests inside another. Continuity of 'SS2A becomes SS3A' is tracked through enrollment history.</w:t>
       </w:r>
     </w:p>
     <w:p>
@@ -1842,7 +1848,7 @@
         <w:pStyle w:val="ListBullet"/>
       </w:pPr>
       <w:r>
-        <w:t>capacity: a nullable integer. The cohort head may set a limit.</w:t>
+        <w:t>capacity: nullable integer for head-set limits.</w:t>
       </w:r>
     </w:p>
     <w:p>
@@ -1850,7 +1856,7 @@
         <w:pStyle w:val="ListBullet"/>
       </w:pPr>
       <w:r>
-        <w:t>is_prime_level: marks a graduating level for automatic alumnus status in a future release.</w:t>
+        <w:t>is_prime_level: marks graduating level for future alumnus status.</w:t>
       </w:r>
     </w:p>
     <w:p/>
@@ -1869,7 +1875,7 @@
           <w:color w:val="3B82F6"/>
           <w:sz w:val="22"/>
         </w:rPr>
-        <w:t>The central hub of the entire system. Not a field on a student record but an independent entity with its own lifecycle.</w:t>
+        <w:t>The central hub of the system. An independent entity with its own lifecycle.</w:t>
       </w:r>
     </w:p>
     <w:p/>
@@ -1892,7 +1898,7 @@
         <w:t xml:space="preserve">Design rationale: </w:t>
       </w:r>
       <w:r>
-        <w:t>This is the most consequential architectural decision in the system. Enrollment is the link table that binds a Student to a Cohort, Offering, or Group for one schedule period. Nearly every operational feature — attendance tracking, grade recording, fee billing, and academic progression — depends on Enrollment rather than on the Student record directly.</w:t>
+        <w:t>The most consequential architectural decision. Enrollment binds a Student to a Cohort, Offering, or Group for one schedule period. Nearly every operational feature depends on it.</w:t>
       </w:r>
     </w:p>
     <w:p>
@@ -1908,7 +1914,7 @@
         <w:pStyle w:val="ListBullet"/>
       </w:pPr>
       <w:r>
-        <w:t>Constraint: every enrollment must have at least one target (cohort, offering, or group).</w:t>
+        <w:t>Must have at least one target (cohort, offering, or group).</w:t>
       </w:r>
     </w:p>
     <w:p>
@@ -1916,7 +1922,7 @@
         <w:pStyle w:val="ListBullet"/>
       </w:pPr>
       <w:r>
-        <w:t>ended_on and closed_reason provide an audit trail for why an enrollment concluded.</w:t>
+        <w:t>ended_on and closed_reason provide an audit trail.</w:t>
       </w:r>
     </w:p>
     <w:p/>
@@ -1954,12 +1960,12 @@
     <w:p/>
     <w:p>
       <w:r>
-        <w:t>Common labels: lesson, lecture, period, seminar, lab, workshop</w:t>
+        <w:t>Common labels: lesson, lecture, period, seminar, lab</w:t>
       </w:r>
     </w:p>
     <w:p>
       <w:r>
-        <w:t>SchoolHub implementation: session + session_attendance + calendar_event</w:t>
+        <w:t>SchoolHub implementation: session + session_attendance</w:t>
       </w:r>
     </w:p>
     <w:p/>
@@ -1971,7 +1977,7 @@
         <w:t xml:space="preserve">Design rationale: </w:t>
       </w:r>
       <w:r>
-        <w:t>Sessions represent the operational unit of teaching. They book resources such as rooms, target a specific cohort_offering (optionally narrowed to a group), and carry per-session attendance records. Calendar events serve a broader purpose for announcements, holidays, and examinations.</w:t>
+        <w:t>Sessions represent the operational unit of teaching. They book resources, target cohort_offerings, and carry per-session attendance.</w:t>
       </w:r>
     </w:p>
     <w:p>
@@ -1979,7 +1985,7 @@
         <w:pStyle w:val="ListBullet"/>
       </w:pPr>
       <w:r>
-        <w:t>recurrence_rule: supports repeating sessions such as "every Monday at 9:00 AM."</w:t>
+        <w:t>recurrence_rule for repeating sessions.</w:t>
       </w:r>
     </w:p>
     <w:p>
@@ -1987,15 +1993,7 @@
         <w:pStyle w:val="ListBullet"/>
       </w:pPr>
       <w:r>
-        <w:t>Per-session attendance coexists with the legacy daily attendance table during the migration period.</w:t>
-      </w:r>
-    </w:p>
-    <w:p>
-      <w:pPr>
-        <w:pStyle w:val="ListBullet"/>
-      </w:pPr>
-      <w:r>
-        <w:t>Session cancellation initiates a workflow request with a comment thread for discussion.</w:t>
+        <w:t>Per-session attendance coexists with legacy daily attendance during migration.</w:t>
       </w:r>
     </w:p>
     <w:p/>
@@ -2014,18 +2012,18 @@
           <w:color w:val="3B82F6"/>
           <w:sz w:val="22"/>
         </w:rPr>
-        <w:t>The time skeleton of the institution. Self-referential so a Term can nest under an Academic Year.</w:t>
+        <w:t>The time skeleton. Self-referential: Term nests under Academic Year.</w:t>
       </w:r>
     </w:p>
     <w:p/>
     <w:p>
       <w:r>
-        <w:t>Common labels: term, semester, trimester, academic year, timetable</w:t>
+        <w:t>Common labels: term, semester, trimester, academic year</w:t>
       </w:r>
     </w:p>
     <w:p>
       <w:r>
-        <w:t>SchoolHub implementation: schedule_period (self-referential via parent_id)</w:t>
+        <w:t>SchoolHub implementation: schedule_period (self-ref)</w:t>
       </w:r>
     </w:p>
     <w:p/>
@@ -2037,7 +2035,7 @@
         <w:t xml:space="preserve">Design rationale: </w:t>
       </w:r>
       <w:r>
-        <w:t>This is the primitive that most frequently causes system failure when designed too rigidly. University semesters, bootcamp rolling intakes, and Montessori continuous cycles require fundamentally different time models. The self-referential design supports any nesting depth and any labels. However, the business rules connecting periods across institution types multiply combinatorially. This project is scoped to term-based K-12 schools and vocational institutes to keep that complexity manageable.</w:t>
+        <w:t>The primitive that most frequently causes system failure. The self-referential design supports any nesting depth, but business rules multiply combinatorially across institution types.</w:t>
       </w:r>
     </w:p>
     <w:p>
@@ -2045,7 +2043,7 @@
         <w:pStyle w:val="ListBullet"/>
       </w:pPr>
       <w:r>
-        <w:t>Phase 1 provides the schema and basic CRUD operations. Full recursive scheduling logic is designated for Phase 2.</w:t>
+        <w:t>Scoped to K-12 term-based schools and vocational institutes.</w:t>
       </w:r>
     </w:p>
     <w:p>
@@ -2053,7 +2051,7 @@
         <w:pStyle w:val="ListBullet"/>
       </w:pPr>
       <w:r>
-        <w:t>Enrollment references schedule_period as its time context.</w:t>
+        <w:t>Phase 1: schema and basic CRUD. Full recursion in Phase 2.</w:t>
       </w:r>
     </w:p>
     <w:p/>
@@ -2085,13 +2083,13 @@
           <w:color w:val="3B82F6"/>
           <w:sz w:val="22"/>
         </w:rPr>
-        <w:t>Any measurement of learning. Carries a publish gate separating data entry from public visibility.</w:t>
+        <w:t>Any measurement of learning with a publish gate separating data entry from visibility.</w:t>
       </w:r>
     </w:p>
     <w:p/>
     <w:p>
       <w:r>
-        <w:t>Common labels: exam, test, quiz, assignment, project, evaluation</w:t>
+        <w:t>Common labels: exam, test, quiz, assignment, project</w:t>
       </w:r>
     </w:p>
     <w:p>
@@ -2108,7 +2106,7 @@
         <w:t xml:space="preserve">Design rationale: </w:t>
       </w:r>
       <w:r>
-        <w:t>Assessments include a publish flag that models the real-world workflow where teachers enter and review scores before releasing them to students. The weight field enables composite scoring across multiple assessments within a term. The pass_mark_percent is configurable per assessment rather than being globally fixed.</w:t>
+        <w:t>Assessments include a publish flag modelling real-world review-before-release workflows. Weight enables composite scoring.</w:t>
       </w:r>
     </w:p>
     <w:p>
@@ -2116,7 +2114,7 @@
         <w:pStyle w:val="ListBullet"/>
       </w:pPr>
       <w:r>
-        <w:t>weight: enables composite scoring where Continuous Assessment is weighted at 30% and Examination at 70%.</w:t>
+        <w:t>weight for composite scoring (CA 30%, Exam 70%).</w:t>
       </w:r>
     </w:p>
     <w:p>
@@ -2124,7 +2122,7 @@
         <w:pStyle w:val="ListBullet"/>
       </w:pPr>
       <w:r>
-        <w:t>published: controls visibility. Unpublished assessments are invisible to students.</w:t>
+        <w:t>published: controls student visibility.</w:t>
       </w:r>
     </w:p>
     <w:p>
@@ -2132,7 +2130,7 @@
         <w:pStyle w:val="ListBullet"/>
       </w:pPr>
       <w:r>
-        <w:t>pass_mark_percent: defaults to 50% but can be set per assessment.</w:t>
+        <w:t>pass_mark_percent configurable per assessment.</w:t>
       </w:r>
     </w:p>
     <w:p/>
@@ -2151,13 +2149,13 @@
           <w:color w:val="3B82F6"/>
           <w:sz w:val="22"/>
         </w:rPr>
-        <w:t>The output of an assessment. One row per student per assessment with score and metadata.</w:t>
+        <w:t>The output of an assessment. One row per student per assessment.</w:t>
       </w:r>
     </w:p>
     <w:p/>
     <w:p>
       <w:r>
-        <w:t>Common labels: grade, score, mark, transcript, report card</w:t>
+        <w:t>Common labels: grade, score, mark, transcript</w:t>
       </w:r>
     </w:p>
     <w:p>
@@ -2174,7 +2172,7 @@
         <w:t xml:space="preserve">Design rationale: </w:t>
       </w:r>
       <w:r>
-        <w:t>Transcripts are generated on demand from live result rows rather than stored as frozen snapshots. This means a corrected score propagates instantly to every view. The trade-off is the inability to certify a historical transcript without versioning. For the current scope, accuracy is prioritised over immutability. A future Credential artifact can reference a frozen PDF certificate.</w:t>
+        <w:t>Transcripts are generated on demand from live result rows. Corrected scores propagate instantly. Accuracy is prioritised over immutability for the current scope.</w:t>
       </w:r>
     </w:p>
     <w:p>
@@ -2182,7 +2180,7 @@
         <w:pStyle w:val="ListBullet"/>
       </w:pPr>
       <w:r>
-        <w:t>is_resit: indicates a retaken assessment, with penalty applied separately.</w:t>
+        <w:t>is_resit and penalty for retaken or late assessments.</w:t>
       </w:r>
     </w:p>
     <w:p>
@@ -2190,15 +2188,7 @@
         <w:pStyle w:val="ListBullet"/>
       </w:pPr>
       <w:r>
-        <w:t>penalty: a deduction applied to the score for late submission or resit conditions.</w:t>
-      </w:r>
-    </w:p>
-    <w:p>
-      <w:pPr>
-        <w:pStyle w:val="ListBullet"/>
-      </w:pPr>
-      <w:r>
-        <w:t>UNIQUE constraint on (assessment_id, student_id): one result per student per assessment.</w:t>
+        <w:t>UNIQUE (assessment_id, student_id).</w:t>
       </w:r>
     </w:p>
     <w:p/>
@@ -2253,7 +2243,7 @@
         <w:t xml:space="preserve">Design rationale: </w:t>
       </w:r>
       <w:r>
-        <w:t>Credentials certify that a person has satisfied the requirements of a programme. They carry a criteria reference that links back to the rule or process that generated them, and an optional artifact URL pointing to a generated certificate document. Revocation is escalated to a moderator through the workflow system: an administrator cannot unilaterally revoke a credential they themselves issued.</w:t>
+        <w:t>Credentials carry a criteria reference linking back to the rule or process that generated them. Revocation escalates to moderator through the workflow system.</w:t>
       </w:r>
     </w:p>
     <w:p>
@@ -2261,7 +2251,7 @@
         <w:pStyle w:val="ListBullet"/>
       </w:pPr>
       <w:r>
-        <w:t>auto_issue_credential on progression_rule: when a student passes, a credential is minted automatically.</w:t>
+        <w:t>auto_issue_credential on progression_rule for automatic minting.</w:t>
       </w:r>
     </w:p>
     <w:p>
@@ -2269,15 +2259,7 @@
         <w:pStyle w:val="ListBullet"/>
       </w:pPr>
       <w:r>
-        <w:t>artifact_url: reserved for future generated PDF certificates.</w:t>
-      </w:r>
-    </w:p>
-    <w:p>
-      <w:pPr>
-        <w:pStyle w:val="ListBullet"/>
-      </w:pPr>
-      <w:r>
-        <w:t>Credential revocation: POST /api/v1/credentials/{id}/revoke initiates a workflow requiring moderator approval.</w:t>
+        <w:t>artifact_url reserved for future PDF certificates.</w:t>
       </w:r>
     </w:p>
     <w:p/>
@@ -2296,13 +2278,13 @@
           <w:color w:val="3B82F6"/>
           <w:sz w:val="22"/>
         </w:rPr>
-        <w:t>Logic that determines whether a learner may advance to the next stage of their programme.</w:t>
+        <w:t>Logic determining whether a learner may advance to the next stage.</w:t>
       </w:r>
     </w:p>
     <w:p/>
     <w:p>
       <w:r>
-        <w:t>Common labels: prerequisite, promotion requirement, graduation condition, pass mark</w:t>
+        <w:t>Common labels: prerequisite, promotion, pass mark</w:t>
       </w:r>
     </w:p>
     <w:p>
@@ -2319,7 +2301,7 @@
         <w:t xml:space="preserve">Design rationale: </w:t>
       </w:r>
       <w:r>
-        <w:t>Progression rules are evaluated to produce results stored as progression_result rows. The rule_type field determines what data is inspected: ATTENDANCE_MINIMUM checks session attendance records, PREREQUISITE_COMPLETION checks prerequisite offerings and results, and MANUAL_SCORE checks a threshold entered by a teacher or administrator. Results are stored after evaluation to prevent redundant recalculation.</w:t>
+        <w:t>Rules are evaluated to produce stored results. ATTENDANCE_MINIMUM, PREREQUISITE_COMPLETION, and MANUAL_SCORE types determine what data is inspected.</w:t>
       </w:r>
     </w:p>
     <w:p>
@@ -2327,7 +2309,7 @@
         <w:pStyle w:val="ListBullet"/>
       </w:pPr>
       <w:r>
-        <w:t>scope_type: COHORT or OFFERING, determining the level at which the rule applies.</w:t>
+        <w:t>scope_type: COHORT or OFFERING.</w:t>
       </w:r>
     </w:p>
     <w:p>
@@ -2335,7 +2317,7 @@
         <w:pStyle w:val="ListBullet"/>
       </w:pPr>
       <w:r>
-        <w:t>Fixed rule-type menu rather than a custom formula parser, avoiding a complete rework of the assessment and result modules.</w:t>
+        <w:t>Fixed rule-type menu rather than custom formula parser.</w:t>
       </w:r>
     </w:p>
     <w:p>
@@ -2343,7 +2325,7 @@
         <w:pStyle w:val="ListBullet"/>
       </w:pPr>
       <w:r>
-        <w:t>Status lifecycle: proposed, active, retired.</w:t>
+        <w:t>Status: proposed, active, retired.</w:t>
       </w:r>
     </w:p>
     <w:p/>
@@ -2375,18 +2357,18 @@
           <w:color w:val="3B82F6"/>
           <w:sz w:val="22"/>
         </w:rPr>
-        <w:t>Any physical or virtual item consumed during instruction. Institution-wide, not owned by a specific organizational unit.</w:t>
+        <w:t>Any physical or virtual item consumed during instruction.</w:t>
       </w:r>
     </w:p>
     <w:p/>
     <w:p>
       <w:r>
-        <w:t>Common labels: room, laboratory, equipment, seat, virtual room</w:t>
+        <w:t>Common labels: room, laboratory, equipment, virtual room</w:t>
       </w:r>
     </w:p>
     <w:p>
       <w:r>
-        <w:t>SchoolHub implementation: resource (self-referential) + resource_permit</w:t>
+        <w:t>SchoolHub implementation: resource (self-ref) + resource_permit</w:t>
       </w:r>
     </w:p>
     <w:p/>
@@ -2398,7 +2380,7 @@
         <w:t xml:space="preserve">Design rationale: </w:t>
       </w:r>
       <w:r>
-        <w:t>Resources are simpler than organizational units: they are flat, institution-wide, and not owned by any department. Equipment can be nested under a room through parent_resource_id. Resources may be restricted to staff only; individual student access is granted through resource_permits. Sessions book resources for specific time slots.</w:t>
+        <w:t>Resources are flat and institution-wide. Equipment nests under rooms. Resources may be staff_only; permits grant individual access.</w:t>
       </w:r>
     </w:p>
     <w:p>
@@ -2406,7 +2388,7 @@
         <w:pStyle w:val="ListBullet"/>
       </w:pPr>
       <w:r>
-        <w:t>Kind values: room, virtual, equipment.</w:t>
+        <w:t>Kind: room, virtual, equipment.</w:t>
       </w:r>
     </w:p>
     <w:p>
@@ -2414,7 +2396,7 @@
         <w:pStyle w:val="ListBullet"/>
       </w:pPr>
       <w:r>
-        <w:t>capacity: nullable. A null value indicates unlimited capacity.</w:t>
+        <w:t>capacity: nullable for unlimited.</w:t>
       </w:r>
     </w:p>
     <w:p>
@@ -2422,7 +2404,7 @@
         <w:pStyle w:val="ListBullet"/>
       </w:pPr>
       <w:r>
-        <w:t>staff_only combined with resource_permit: a staff-restricted resource can be accessed by a student who holds a permit.</w:t>
+        <w:t>staff_only + resource_permit for access control.</w:t>
       </w:r>
     </w:p>
     <w:p/>
@@ -2441,18 +2423,18 @@
           <w:color w:val="3B82F6"/>
           <w:sz w:val="22"/>
         </w:rPr>
-        <w:t>All money flows within the institution: invoices, payments, waivers, and scholarships.</w:t>
+        <w:t>All money flows: invoices, payments, waivers, scholarships.</w:t>
       </w:r>
     </w:p>
     <w:p/>
     <w:p>
       <w:r>
-        <w:t>Common labels: tuition, fee, invoice, scholarship, instalment</w:t>
+        <w:t>Common labels: tuition, fee, invoice, scholarship</w:t>
       </w:r>
     </w:p>
     <w:p>
       <w:r>
-        <w:t>SchoolHub implementation: fee_invoice + fee_payment + fee_waiver + scholarship_rule + financial_settings</w:t>
+        <w:t>SchoolHub implementation: fee_invoice + fee_payment + waiver + scholarship</w:t>
       </w:r>
     </w:p>
     <w:p/>
@@ -2464,7 +2446,7 @@
         <w:t xml:space="preserve">Design rationale: </w:t>
       </w:r>
       <w:r>
-        <w:t>The financial subsystem is a complete graph of money movement. Invoices can be issued to individual students, entire classes, or the whole school. Categories are administrator-editable and include fee, book, participation, and other. The compulsory flag drives the "For You" deadline tracking system that shows students their outstanding obligations with red-ticking urgency. A draft-then-approve workflow separates staff submission from administrator authorisation. Payment processing uses an adapter pattern: Stripe integration is currently in progress to provide live payment gateway functionality.</w:t>
+        <w:t>Invoices fan out to students, classes, or the whole school. Draft-then-approve separates staff submission from admin authorisation. Payment uses an adapter pattern: Stripe integration is in progress.</w:t>
       </w:r>
     </w:p>
     <w:p>
@@ -2472,7 +2454,7 @@
         <w:pStyle w:val="ListBullet"/>
       </w:pPr>
       <w:r>
-        <w:t>Currency: configured per tenant through financial_settings. Defaults to NGN with the Naira symbol.</w:t>
+        <w:t>Currency configurable per tenant (default NGN).</w:t>
       </w:r>
     </w:p>
     <w:p>
@@ -2480,7 +2462,7 @@
         <w:pStyle w:val="ListBullet"/>
       </w:pPr>
       <w:r>
-        <w:t>Scholarship rules: percentage-based discounts scoped to an offering with configurable threshold values.</w:t>
+        <w:t>Scholarship rules: percentage-based discounts.</w:t>
       </w:r>
     </w:p>
     <w:p>
@@ -2488,7 +2470,7 @@
         <w:pStyle w:val="ListBullet"/>
       </w:pPr>
       <w:r>
-        <w:t>Waivers: reduce outstanding balances like payments but without money changing hands.</w:t>
+        <w:t>Waivers reduce balances without money changing hands.</w:t>
       </w:r>
     </w:p>
     <w:p>
@@ -2496,23 +2478,7 @@
         <w:pStyle w:val="ListBullet"/>
       </w:pPr>
       <w:r>
-        <w:t>Refunds: modelled as negative payment rows of kind "refund," netting out automatically in balance calculations.</w:t>
-      </w:r>
-    </w:p>
-    <w:p>
-      <w:pPr>
-        <w:pStyle w:val="ListBullet"/>
-      </w:pPr>
-      <w:r>
-        <w:t>Draft workflow: non-administrator staff create drafts; administrators approve or reject entire batches.</w:t>
-      </w:r>
-    </w:p>
-    <w:p>
-      <w:pPr>
-        <w:pStyle w:val="ListBullet"/>
-      </w:pPr>
-      <w:r>
-        <w:t>Stripe integration: currently being implemented to replace the simulated payment adapter with live processing.</w:t>
+        <w:t>Refunds: negative payment rows netting out automatically.</w:t>
       </w:r>
     </w:p>
     <w:p/>
@@ -2531,7 +2497,7 @@
     </w:p>
     <w:p>
       <w:r>
-        <w:t>Three of the fourteen primitives are existential. If they are modelled incorrectly, the system collapses at the first real-world edge case. If they are modelled correctly, everything else aligns naturally around them.</w:t>
+        <w:t>Three of the fourteen primitives are existential. If modelled incorrectly, the system collapses at the first real-world edge case.</w:t>
       </w:r>
     </w:p>
     <w:p>
@@ -2548,7 +2514,7 @@
           <w:b/>
           <w:color w:val="DC2626"/>
         </w:rPr>
-        <w:t xml:space="preserve">Incorrect approach: </w:t>
+        <w:t xml:space="preserve">Incorrect: </w:t>
       </w:r>
       <w:r>
         <w:t>Creating separate database tables for Student, Teacher, and Guardian.</w:t>
@@ -2560,15 +2526,15 @@
           <w:b/>
           <w:color w:val="10B981"/>
         </w:rPr>
-        <w:t xml:space="preserve">Correct approach: </w:t>
+        <w:t xml:space="preserve">Correct: </w:t>
       </w:r>
       <w:r>
-        <w:t>A single Person table with Role modelled as a relationship through a join table.</w:t>
+        <w:t>A single Person table with Role as a relationship through a join table.</w:t>
       </w:r>
     </w:p>
     <w:p>
       <w:r>
-        <w:t>A PhD student who also teaches undergraduate courses must not be a schema contradiction. With the correct model, they simply hold two role assignments. With the incorrect model, the system must be restructured the moment the first exception appears. SchoolHub implements this correctly: one app_user table with role_assignments linking users to roles within specific tenants.</w:t>
+        <w:t>A PhD student who also teaches must not be a schema contradiction. With the correct model, they simply hold two role assignments.</w:t>
       </w:r>
     </w:p>
     <w:p>
@@ -2585,7 +2551,7 @@
           <w:b/>
           <w:color w:val="DC2626"/>
         </w:rPr>
-        <w:t xml:space="preserve">Incorrect approach: </w:t>
+        <w:t xml:space="preserve">Incorrect: </w:t>
       </w:r>
       <w:r>
         <w:t>Adding a class_id column to the Student record.</w:t>
@@ -2597,7 +2563,7 @@
           <w:b/>
           <w:color w:val="10B981"/>
         </w:rPr>
-        <w:t xml:space="preserve">Correct approach: </w:t>
+        <w:t xml:space="preserve">Correct: </w:t>
       </w:r>
       <w:r>
         <w:t>Enrollment as an independent entity with its own lifecycle, dates, status, and relationships.</w:t>
@@ -2605,7 +2571,7 @@
     </w:p>
     <w:p>
       <w:r>
-        <w:t>Enrollment is the hub of the entire data model. Attendance tracking, grade recording, fee billing, and academic progression all depend on Enrollment rather than on the Student record directly. It answers the question: "Which student is in which cohort or offering during which time period, and what is their current status?" The legacy student.class_id column is transitional and scheduled for removal once all data access paths have been migrated.</w:t>
+        <w:t>Attendance, grading, billing, and progression all depend on Enrollment rather than on Student directly. The legacy student.class_id is transitional.</w:t>
       </w:r>
     </w:p>
     <w:p>
@@ -2622,7 +2588,7 @@
           <w:b/>
           <w:color w:val="DC2626"/>
         </w:rPr>
-        <w:t xml:space="preserve">Incorrect approach: </w:t>
+        <w:t xml:space="preserve">Incorrect: </w:t>
       </w:r>
       <w:r>
         <w:t>A single hardcoded Term or Semester model with fixed nesting levels.</w:t>
@@ -2634,7 +2600,7 @@
           <w:b/>
           <w:color w:val="10B981"/>
         </w:rPr>
-        <w:t xml:space="preserve">Correct approach: </w:t>
+        <w:t xml:space="preserve">Correct: </w:t>
       </w:r>
       <w:r>
         <w:t>A self-referential schedule_period table supporting any depth of nesting with configurable labels.</w:t>
@@ -2642,7 +2608,7 @@
     </w:p>
     <w:p>
       <w:r>
-        <w:t>This is the primitive that most frequently causes systems to fail when they encounter a new institution type. University semesters, bootcamp rolling intakes, and Montessori continuous cycles require fundamentally different time models. The self-referential design supports all of them at the schema level, but the business rules connecting periods multiply combinatorially. This project is deliberately scoped to K-12 term-based schools and vocational institutes, where the time model is well-understood and consistent.</w:t>
+        <w:t>This primitive most frequently causes system failure. Different institution types require fundamentally different time models. Scoped to K-12 term-based schools.</w:t>
       </w:r>
     </w:p>
     <w:p>
@@ -2672,58 +2638,12 @@
     <w:p/>
     <w:p>
       <w:r>
-        <w:t>The fourteen primitives constitute the vocabulary. The rules that connect them constitute the cost. A truly universal system — one that handles every type of learning institution with no code changes — is a career-length undertaking, not a single project. The rules multiply combinatorially because each institution type requires fundamentally different business logic operating on the same fourteen tables.</w:t>
+        <w:t>The fourteen primitives constitute the vocabulary. The rules connecting them constitute the cost. A truly universal system is a career-length undertaking.</w:t>
       </w:r>
     </w:p>
     <w:p>
       <w:r>
-        <w:t>Consider the following examples:</w:t>
-      </w:r>
-    </w:p>
-    <w:p>
-      <w:pPr>
-        <w:pStyle w:val="ListBullet"/>
-      </w:pPr>
-      <w:r>
-        <w:t>A university requires prerequisite chains spanning multiple semesters with credit-hour accumulation and validation.</w:t>
-      </w:r>
-    </w:p>
-    <w:p>
-      <w:pPr>
-        <w:pStyle w:val="ListBullet"/>
-      </w:pPr>
-      <w:r>
-        <w:t>A coding bootcamp needs rolling intakes where cohorts overlap and students may join a programme mid-cycle.</w:t>
-      </w:r>
-    </w:p>
-    <w:p>
-      <w:pPr>
-        <w:pStyle w:val="ListBullet"/>
-      </w:pPr>
-      <w:r>
-        <w:t>A Montessori school uses continuous observational assessment with no fixed academic terms.</w:t>
-      </w:r>
-    </w:p>
-    <w:p>
-      <w:pPr>
-        <w:pStyle w:val="ListBullet"/>
-      </w:pPr>
-      <w:r>
-        <w:t>A prison education programme requires security-cleared resource booking with inmate movement tracking.</w:t>
-      </w:r>
-    </w:p>
-    <w:p>
-      <w:pPr>
-        <w:pStyle w:val="ListBullet"/>
-      </w:pPr>
-      <w:r>
-        <w:t>A corporate learning management system uses competency-based progression with no cohort concept at all.</w:t>
-      </w:r>
-    </w:p>
-    <w:p/>
-    <w:p>
-      <w:r>
-        <w:t>Each of these scenarios requires different business logic operating on the same fourteen tables. Supporting all of them simultaneously means every code path must branch on institution type, and the testing surface becomes exponential.</w:t>
+        <w:t>Each institution type requires different business logic on the same fourteen tables. Supporting all simultaneously means every code path branches on institution type.</w:t>
       </w:r>
     </w:p>
     <w:p/>
@@ -2738,31 +2658,7 @@
     </w:p>
     <w:p>
       <w:r>
-        <w:t>This scope is:</w:t>
-      </w:r>
-    </w:p>
-    <w:p>
-      <w:pPr>
-        <w:pStyle w:val="ListBullet"/>
-      </w:pPr>
-      <w:r>
-        <w:t>Achievable within the project timeframe.</w:t>
-      </w:r>
-    </w:p>
-    <w:p>
-      <w:pPr>
-        <w:pStyle w:val="ListBullet"/>
-      </w:pPr>
-      <w:r>
-        <w:t>Defensible under academic examination: "I deliberately scoped to two institution types that share structural characteristics."</w:t>
-      </w:r>
-    </w:p>
-    <w:p>
-      <w:pPr>
-        <w:pStyle w:val="ListBullet"/>
-      </w:pPr>
-      <w:r>
-        <w:t>Extensible in the future: the database schema already supports deeper nesting; the rules layer is where scope is bounded.</w:t>
+        <w:t>Achievable within the project timeframe. Defensible under academic examination. Extensible: the schema already supports deeper nesting.</w:t>
       </w:r>
     </w:p>
     <w:p>
@@ -2775,7 +2671,7 @@
           <w:color w:val="64738B"/>
           <w:sz w:val="20"/>
         </w:rPr>
-        <w:t>Claiming configurability across all learning institutions invites questions about prison education programmes, corporate LMS platforms, and driving schools — with no satisfactory answer. Two specific institution types is honest, testable, and defensible.</w:t>
+        <w:t>Two specific institution types is honest, testable, and defensible.</w:t>
       </w:r>
     </w:p>
     <w:p>
@@ -2788,12 +2684,1081 @@
         <w:pStyle w:val="Heading1"/>
       </w:pPr>
       <w:r>
-        <w:t>12. Implementation Status</w:t>
+        <w:t>12. Dependencies Used</w:t>
       </w:r>
     </w:p>
     <w:p>
       <w:r>
-        <w:t>The following table maps each primitive to its implementation in the SchoolHub codebase and indicates the current development status.</w:t>
+        <w:t>The following table documents the technology stack and external dependencies employed in the SchoolHub project.</w:t>
+      </w:r>
+    </w:p>
+    <w:tbl>
+      <w:tblPr>
+        <w:tblStyle w:val="TableGrid"/>
+        <w:tblW w:type="auto" w:w="0"/>
+        <w:tblLook w:firstColumn="1" w:firstRow="1" w:lastColumn="0" w:lastRow="0" w:noHBand="0" w:noVBand="1" w:val="04A0"/>
+      </w:tblPr>
+      <w:tblGrid>
+        <w:gridCol w:w="2160"/>
+        <w:gridCol w:w="2160"/>
+        <w:gridCol w:w="2160"/>
+        <w:gridCol w:w="2160"/>
+      </w:tblGrid>
+      <w:tr>
+        <w:tc>
+          <w:tcPr>
+            <w:tcW w:type="dxa" w:w="1247"/>
+            <w:shd w:fill="0F172A" w:val="clear"/>
+          </w:tcPr>
+          <w:p>
+            <w:pPr>
+              <w:jc w:val="center"/>
+            </w:pPr>
+            <w:r>
+              <w:rPr>
+                <w:b/>
+                <w:color w:val="FFFFFF"/>
+                <w:sz w:val="18"/>
+              </w:rPr>
+              <w:t>Category</w:t>
+            </w:r>
+          </w:p>
+        </w:tc>
+        <w:tc>
+          <w:tcPr>
+            <w:tcW w:type="dxa" w:w="1984"/>
+            <w:shd w:fill="0F172A" w:val="clear"/>
+          </w:tcPr>
+          <w:p>
+            <w:pPr>
+              <w:jc w:val="center"/>
+            </w:pPr>
+            <w:r>
+              <w:rPr>
+                <w:b/>
+                <w:color w:val="FFFFFF"/>
+                <w:sz w:val="18"/>
+              </w:rPr>
+              <w:t>Dependency</w:t>
+            </w:r>
+          </w:p>
+        </w:tc>
+        <w:tc>
+          <w:tcPr>
+            <w:tcW w:type="dxa" w:w="1020"/>
+            <w:shd w:fill="0F172A" w:val="clear"/>
+          </w:tcPr>
+          <w:p>
+            <w:pPr>
+              <w:jc w:val="center"/>
+            </w:pPr>
+            <w:r>
+              <w:rPr>
+                <w:b/>
+                <w:color w:val="FFFFFF"/>
+                <w:sz w:val="18"/>
+              </w:rPr>
+              <w:t>Version</w:t>
+            </w:r>
+          </w:p>
+        </w:tc>
+        <w:tc>
+          <w:tcPr>
+            <w:tcW w:type="dxa" w:w="3402"/>
+            <w:shd w:fill="0F172A" w:val="clear"/>
+          </w:tcPr>
+          <w:p>
+            <w:pPr>
+              <w:jc w:val="center"/>
+            </w:pPr>
+            <w:r>
+              <w:rPr>
+                <w:b/>
+                <w:color w:val="FFFFFF"/>
+                <w:sz w:val="18"/>
+              </w:rPr>
+              <w:t>Purpose</w:t>
+            </w:r>
+          </w:p>
+        </w:tc>
+      </w:tr>
+      <w:tr>
+        <w:tc>
+          <w:tcPr>
+            <w:tcW w:type="dxa" w:w="1247"/>
+            <w:shd w:fill="F1F5F9" w:val="clear"/>
+          </w:tcPr>
+          <w:p>
+            <w:r>
+              <w:rPr>
+                <w:sz w:val="18"/>
+              </w:rPr>
+              <w:t>Framework</w:t>
+            </w:r>
+          </w:p>
+        </w:tc>
+        <w:tc>
+          <w:tcPr>
+            <w:tcW w:type="dxa" w:w="1984"/>
+            <w:shd w:fill="F1F5F9" w:val="clear"/>
+          </w:tcPr>
+          <w:p>
+            <w:r>
+              <w:rPr>
+                <w:sz w:val="18"/>
+              </w:rPr>
+              <w:t>Spring Boot</w:t>
+            </w:r>
+          </w:p>
+        </w:tc>
+        <w:tc>
+          <w:tcPr>
+            <w:tcW w:type="dxa" w:w="1020"/>
+            <w:shd w:fill="F1F5F9" w:val="clear"/>
+          </w:tcPr>
+          <w:p>
+            <w:r>
+              <w:rPr>
+                <w:sz w:val="18"/>
+              </w:rPr>
+              <w:t>3.5.14</w:t>
+            </w:r>
+          </w:p>
+        </w:tc>
+        <w:tc>
+          <w:tcPr>
+            <w:tcW w:type="dxa" w:w="3402"/>
+            <w:shd w:fill="F1F5F9" w:val="clear"/>
+          </w:tcPr>
+          <w:p>
+            <w:r>
+              <w:rPr>
+                <w:sz w:val="18"/>
+              </w:rPr>
+              <w:t>Application framework; inversion of control and dependency injection</w:t>
+            </w:r>
+          </w:p>
+        </w:tc>
+      </w:tr>
+      <w:tr>
+        <w:tc>
+          <w:tcPr>
+            <w:tcW w:type="dxa" w:w="1247"/>
+          </w:tcPr>
+          <w:p>
+            <w:r>
+              <w:rPr>
+                <w:sz w:val="18"/>
+              </w:rPr>
+              <w:t>Framework</w:t>
+            </w:r>
+          </w:p>
+        </w:tc>
+        <w:tc>
+          <w:tcPr>
+            <w:tcW w:type="dxa" w:w="1984"/>
+          </w:tcPr>
+          <w:p>
+            <w:r>
+              <w:rPr>
+                <w:sz w:val="18"/>
+              </w:rPr>
+              <w:t>Spring Security</w:t>
+            </w:r>
+          </w:p>
+        </w:tc>
+        <w:tc>
+          <w:tcPr>
+            <w:tcW w:type="dxa" w:w="1020"/>
+          </w:tcPr>
+          <w:p>
+            <w:r>
+              <w:rPr>
+                <w:sz w:val="18"/>
+              </w:rPr>
+              <w:t>3.5.14</w:t>
+            </w:r>
+          </w:p>
+        </w:tc>
+        <w:tc>
+          <w:tcPr>
+            <w:tcW w:type="dxa" w:w="3402"/>
+          </w:tcPr>
+          <w:p>
+            <w:r>
+              <w:rPr>
+                <w:sz w:val="18"/>
+              </w:rPr>
+              <w:t>Authentication, authorisation, and role-based access control</w:t>
+            </w:r>
+          </w:p>
+        </w:tc>
+      </w:tr>
+      <w:tr>
+        <w:tc>
+          <w:tcPr>
+            <w:tcW w:type="dxa" w:w="1247"/>
+            <w:shd w:fill="F1F5F9" w:val="clear"/>
+          </w:tcPr>
+          <w:p>
+            <w:r>
+              <w:rPr>
+                <w:sz w:val="18"/>
+              </w:rPr>
+              <w:t>Framework</w:t>
+            </w:r>
+          </w:p>
+        </w:tc>
+        <w:tc>
+          <w:tcPr>
+            <w:tcW w:type="dxa" w:w="1984"/>
+            <w:shd w:fill="F1F5F9" w:val="clear"/>
+          </w:tcPr>
+          <w:p>
+            <w:r>
+              <w:rPr>
+                <w:sz w:val="18"/>
+              </w:rPr>
+              <w:t>Spring Data JPA</w:t>
+            </w:r>
+          </w:p>
+        </w:tc>
+        <w:tc>
+          <w:tcPr>
+            <w:tcW w:type="dxa" w:w="1020"/>
+            <w:shd w:fill="F1F5F9" w:val="clear"/>
+          </w:tcPr>
+          <w:p>
+            <w:r>
+              <w:rPr>
+                <w:sz w:val="18"/>
+              </w:rPr>
+              <w:t>3.5.14</w:t>
+            </w:r>
+          </w:p>
+        </w:tc>
+        <w:tc>
+          <w:tcPr>
+            <w:tcW w:type="dxa" w:w="3402"/>
+            <w:shd w:fill="F1F5F9" w:val="clear"/>
+          </w:tcPr>
+          <w:p>
+            <w:r>
+              <w:rPr>
+                <w:sz w:val="18"/>
+              </w:rPr>
+              <w:t>Object-relational mapping, repository abstraction, and query derivation</w:t>
+            </w:r>
+          </w:p>
+        </w:tc>
+      </w:tr>
+      <w:tr>
+        <w:tc>
+          <w:tcPr>
+            <w:tcW w:type="dxa" w:w="1247"/>
+          </w:tcPr>
+          <w:p>
+            <w:r>
+              <w:rPr>
+                <w:sz w:val="18"/>
+              </w:rPr>
+              <w:t>Framework</w:t>
+            </w:r>
+          </w:p>
+        </w:tc>
+        <w:tc>
+          <w:tcPr>
+            <w:tcW w:type="dxa" w:w="1984"/>
+          </w:tcPr>
+          <w:p>
+            <w:r>
+              <w:rPr>
+                <w:sz w:val="18"/>
+              </w:rPr>
+              <w:t>Spring Web (Apache Tomcat)</w:t>
+            </w:r>
+          </w:p>
+        </w:tc>
+        <w:tc>
+          <w:tcPr>
+            <w:tcW w:type="dxa" w:w="1020"/>
+          </w:tcPr>
+          <w:p>
+            <w:r>
+              <w:rPr>
+                <w:sz w:val="18"/>
+              </w:rPr>
+              <w:t>10.1.54</w:t>
+            </w:r>
+          </w:p>
+        </w:tc>
+        <w:tc>
+          <w:tcPr>
+            <w:tcW w:type="dxa" w:w="3402"/>
+          </w:tcPr>
+          <w:p>
+            <w:r>
+              <w:rPr>
+                <w:sz w:val="18"/>
+              </w:rPr>
+              <w:t>Embedded HTTP server and RESTful endpoint hosting</w:t>
+            </w:r>
+          </w:p>
+        </w:tc>
+      </w:tr>
+      <w:tr>
+        <w:tc>
+          <w:tcPr>
+            <w:tcW w:type="dxa" w:w="1247"/>
+            <w:shd w:fill="F1F5F9" w:val="clear"/>
+          </w:tcPr>
+          <w:p>
+            <w:r>
+              <w:rPr>
+                <w:sz w:val="18"/>
+              </w:rPr>
+              <w:t>Framework</w:t>
+            </w:r>
+          </w:p>
+        </w:tc>
+        <w:tc>
+          <w:tcPr>
+            <w:tcW w:type="dxa" w:w="1984"/>
+            <w:shd w:fill="F1F5F9" w:val="clear"/>
+          </w:tcPr>
+          <w:p>
+            <w:r>
+              <w:rPr>
+                <w:sz w:val="18"/>
+              </w:rPr>
+              <w:t>Spring Boot Actuator</w:t>
+            </w:r>
+          </w:p>
+        </w:tc>
+        <w:tc>
+          <w:tcPr>
+            <w:tcW w:type="dxa" w:w="1020"/>
+            <w:shd w:fill="F1F5F9" w:val="clear"/>
+          </w:tcPr>
+          <w:p>
+            <w:r>
+              <w:rPr>
+                <w:sz w:val="18"/>
+              </w:rPr>
+              <w:t>3.5.14</w:t>
+            </w:r>
+          </w:p>
+        </w:tc>
+        <w:tc>
+          <w:tcPr>
+            <w:tcW w:type="dxa" w:w="3402"/>
+            <w:shd w:fill="F1F5F9" w:val="clear"/>
+          </w:tcPr>
+          <w:p>
+            <w:r>
+              <w:rPr>
+                <w:sz w:val="18"/>
+              </w:rPr>
+              <w:t>Application health checks and operational monitoring endpoints</w:t>
+            </w:r>
+          </w:p>
+        </w:tc>
+      </w:tr>
+      <w:tr>
+        <w:tc>
+          <w:tcPr>
+            <w:tcW w:type="dxa" w:w="1247"/>
+          </w:tcPr>
+          <w:p>
+            <w:r>
+              <w:rPr>
+                <w:sz w:val="18"/>
+              </w:rPr>
+              <w:t>Framework</w:t>
+            </w:r>
+          </w:p>
+        </w:tc>
+        <w:tc>
+          <w:tcPr>
+            <w:tcW w:type="dxa" w:w="1984"/>
+          </w:tcPr>
+          <w:p>
+            <w:r>
+              <w:rPr>
+                <w:sz w:val="18"/>
+              </w:rPr>
+              <w:t>Spring Boot Validation</w:t>
+            </w:r>
+          </w:p>
+        </w:tc>
+        <w:tc>
+          <w:tcPr>
+            <w:tcW w:type="dxa" w:w="1020"/>
+          </w:tcPr>
+          <w:p>
+            <w:r>
+              <w:rPr>
+                <w:sz w:val="18"/>
+              </w:rPr>
+              <w:t>3.5.14</w:t>
+            </w:r>
+          </w:p>
+        </w:tc>
+        <w:tc>
+          <w:tcPr>
+            <w:tcW w:type="dxa" w:w="3402"/>
+          </w:tcPr>
+          <w:p>
+            <w:r>
+              <w:rPr>
+                <w:sz w:val="18"/>
+              </w:rPr>
+              <w:t>Declarative request DTO validation</w:t>
+            </w:r>
+          </w:p>
+        </w:tc>
+      </w:tr>
+      <w:tr>
+        <w:tc>
+          <w:tcPr>
+            <w:tcW w:type="dxa" w:w="1247"/>
+            <w:shd w:fill="F1F5F9" w:val="clear"/>
+          </w:tcPr>
+          <w:p>
+            <w:r>
+              <w:rPr>
+                <w:sz w:val="18"/>
+              </w:rPr>
+              <w:t>Framework</w:t>
+            </w:r>
+          </w:p>
+        </w:tc>
+        <w:tc>
+          <w:tcPr>
+            <w:tcW w:type="dxa" w:w="1984"/>
+            <w:shd w:fill="F1F5F9" w:val="clear"/>
+          </w:tcPr>
+          <w:p>
+            <w:r>
+              <w:rPr>
+                <w:sz w:val="18"/>
+              </w:rPr>
+              <w:t>Spring Boot Mail</w:t>
+            </w:r>
+          </w:p>
+        </w:tc>
+        <w:tc>
+          <w:tcPr>
+            <w:tcW w:type="dxa" w:w="1020"/>
+            <w:shd w:fill="F1F5F9" w:val="clear"/>
+          </w:tcPr>
+          <w:p>
+            <w:r>
+              <w:rPr>
+                <w:sz w:val="18"/>
+              </w:rPr>
+              <w:t>3.5.14</w:t>
+            </w:r>
+          </w:p>
+        </w:tc>
+        <w:tc>
+          <w:tcPr>
+            <w:tcW w:type="dxa" w:w="3402"/>
+            <w:shd w:fill="F1F5F9" w:val="clear"/>
+          </w:tcPr>
+          <w:p>
+            <w:r>
+              <w:rPr>
+                <w:sz w:val="18"/>
+              </w:rPr>
+              <w:t>Email notification support (AuthService only)</w:t>
+            </w:r>
+          </w:p>
+        </w:tc>
+      </w:tr>
+      <w:tr>
+        <w:tc>
+          <w:tcPr>
+            <w:tcW w:type="dxa" w:w="1247"/>
+          </w:tcPr>
+          <w:p>
+            <w:r>
+              <w:rPr>
+                <w:sz w:val="18"/>
+              </w:rPr>
+              <w:t>Authentication</w:t>
+            </w:r>
+          </w:p>
+        </w:tc>
+        <w:tc>
+          <w:tcPr>
+            <w:tcW w:type="dxa" w:w="1984"/>
+          </w:tcPr>
+          <w:p>
+            <w:r>
+              <w:rPr>
+                <w:sz w:val="18"/>
+              </w:rPr>
+              <w:t>JJWT (io.jsonwebtoken)</w:t>
+            </w:r>
+          </w:p>
+        </w:tc>
+        <w:tc>
+          <w:tcPr>
+            <w:tcW w:type="dxa" w:w="1020"/>
+          </w:tcPr>
+          <w:p>
+            <w:r>
+              <w:rPr>
+                <w:sz w:val="18"/>
+              </w:rPr>
+              <w:t>0.12.6</w:t>
+            </w:r>
+          </w:p>
+        </w:tc>
+        <w:tc>
+          <w:tcPr>
+            <w:tcW w:type="dxa" w:w="3402"/>
+          </w:tcPr>
+          <w:p>
+            <w:r>
+              <w:rPr>
+                <w:sz w:val="18"/>
+              </w:rPr>
+              <w:t>JSON Web Token creation, signing, and verification</w:t>
+            </w:r>
+          </w:p>
+        </w:tc>
+      </w:tr>
+      <w:tr>
+        <w:tc>
+          <w:tcPr>
+            <w:tcW w:type="dxa" w:w="1247"/>
+            <w:shd w:fill="F1F5F9" w:val="clear"/>
+          </w:tcPr>
+          <w:p>
+            <w:r>
+              <w:rPr>
+                <w:sz w:val="18"/>
+              </w:rPr>
+              <w:t>Database</w:t>
+            </w:r>
+          </w:p>
+        </w:tc>
+        <w:tc>
+          <w:tcPr>
+            <w:tcW w:type="dxa" w:w="1984"/>
+            <w:shd w:fill="F1F5F9" w:val="clear"/>
+          </w:tcPr>
+          <w:p>
+            <w:r>
+              <w:rPr>
+                <w:sz w:val="18"/>
+              </w:rPr>
+              <w:t>PostgreSQL JDBC Driver</w:t>
+            </w:r>
+          </w:p>
+        </w:tc>
+        <w:tc>
+          <w:tcPr>
+            <w:tcW w:type="dxa" w:w="1020"/>
+            <w:shd w:fill="F1F5F9" w:val="clear"/>
+          </w:tcPr>
+          <w:p>
+            <w:r>
+              <w:rPr>
+                <w:sz w:val="18"/>
+              </w:rPr>
+              <w:t>42.7.x</w:t>
+            </w:r>
+          </w:p>
+        </w:tc>
+        <w:tc>
+          <w:tcPr>
+            <w:tcW w:type="dxa" w:w="3402"/>
+            <w:shd w:fill="F1F5F9" w:val="clear"/>
+          </w:tcPr>
+          <w:p>
+            <w:r>
+              <w:rPr>
+                <w:sz w:val="18"/>
+              </w:rPr>
+              <w:t>Postgres database connectivity with schema-per-tenant isolation</w:t>
+            </w:r>
+          </w:p>
+        </w:tc>
+      </w:tr>
+      <w:tr>
+        <w:tc>
+          <w:tcPr>
+            <w:tcW w:type="dxa" w:w="1247"/>
+          </w:tcPr>
+          <w:p>
+            <w:r>
+              <w:rPr>
+                <w:sz w:val="18"/>
+              </w:rPr>
+              <w:t>Connection Pool</w:t>
+            </w:r>
+          </w:p>
+        </w:tc>
+        <w:tc>
+          <w:tcPr>
+            <w:tcW w:type="dxa" w:w="1984"/>
+          </w:tcPr>
+          <w:p>
+            <w:r>
+              <w:rPr>
+                <w:sz w:val="18"/>
+              </w:rPr>
+              <w:t>HikariCP</w:t>
+            </w:r>
+          </w:p>
+        </w:tc>
+        <w:tc>
+          <w:tcPr>
+            <w:tcW w:type="dxa" w:w="1020"/>
+          </w:tcPr>
+          <w:p>
+            <w:r>
+              <w:rPr>
+                <w:sz w:val="18"/>
+              </w:rPr>
+              <w:t>(bundled)</w:t>
+            </w:r>
+          </w:p>
+        </w:tc>
+        <w:tc>
+          <w:tcPr>
+            <w:tcW w:type="dxa" w:w="3402"/>
+          </w:tcPr>
+          <w:p>
+            <w:r>
+              <w:rPr>
+                <w:sz w:val="18"/>
+              </w:rPr>
+              <w:t>High-performance JDBC connection pooling</w:t>
+            </w:r>
+          </w:p>
+        </w:tc>
+      </w:tr>
+      <w:tr>
+        <w:tc>
+          <w:tcPr>
+            <w:tcW w:type="dxa" w:w="1247"/>
+            <w:shd w:fill="F1F5F9" w:val="clear"/>
+          </w:tcPr>
+          <w:p>
+            <w:r>
+              <w:rPr>
+                <w:sz w:val="18"/>
+              </w:rPr>
+              <w:t>ORM</w:t>
+            </w:r>
+          </w:p>
+        </w:tc>
+        <w:tc>
+          <w:tcPr>
+            <w:tcW w:type="dxa" w:w="1984"/>
+            <w:shd w:fill="F1F5F9" w:val="clear"/>
+          </w:tcPr>
+          <w:p>
+            <w:r>
+              <w:rPr>
+                <w:sz w:val="18"/>
+              </w:rPr>
+              <w:t>Hibernate ORM</w:t>
+            </w:r>
+          </w:p>
+        </w:tc>
+        <w:tc>
+          <w:tcPr>
+            <w:tcW w:type="dxa" w:w="1020"/>
+            <w:shd w:fill="F1F5F9" w:val="clear"/>
+          </w:tcPr>
+          <w:p>
+            <w:r>
+              <w:rPr>
+                <w:sz w:val="18"/>
+              </w:rPr>
+              <w:t>6.6.49</w:t>
+            </w:r>
+          </w:p>
+        </w:tc>
+        <w:tc>
+          <w:tcPr>
+            <w:tcW w:type="dxa" w:w="3402"/>
+            <w:shd w:fill="F1F5F9" w:val="clear"/>
+          </w:tcPr>
+          <w:p>
+            <w:r>
+              <w:rPr>
+                <w:sz w:val="18"/>
+              </w:rPr>
+              <w:t>Entity lifecycle management and schema auto-detection</w:t>
+            </w:r>
+          </w:p>
+        </w:tc>
+      </w:tr>
+      <w:tr>
+        <w:tc>
+          <w:tcPr>
+            <w:tcW w:type="dxa" w:w="1247"/>
+          </w:tcPr>
+          <w:p>
+            <w:r>
+              <w:rPr>
+                <w:sz w:val="18"/>
+              </w:rPr>
+              <w:t>Serialisation</w:t>
+            </w:r>
+          </w:p>
+        </w:tc>
+        <w:tc>
+          <w:tcPr>
+            <w:tcW w:type="dxa" w:w="1984"/>
+          </w:tcPr>
+          <w:p>
+            <w:r>
+              <w:rPr>
+                <w:sz w:val="18"/>
+              </w:rPr>
+              <w:t>Jackson</w:t>
+            </w:r>
+          </w:p>
+        </w:tc>
+        <w:tc>
+          <w:tcPr>
+            <w:tcW w:type="dxa" w:w="1020"/>
+          </w:tcPr>
+          <w:p>
+            <w:r>
+              <w:rPr>
+                <w:sz w:val="18"/>
+              </w:rPr>
+              <w:t>(bundled)</w:t>
+            </w:r>
+          </w:p>
+        </w:tc>
+        <w:tc>
+          <w:tcPr>
+            <w:tcW w:type="dxa" w:w="3402"/>
+          </w:tcPr>
+          <w:p>
+            <w:r>
+              <w:rPr>
+                <w:sz w:val="18"/>
+              </w:rPr>
+              <w:t>JSON serialisation and deserialisation</w:t>
+            </w:r>
+          </w:p>
+        </w:tc>
+      </w:tr>
+      <w:tr>
+        <w:tc>
+          <w:tcPr>
+            <w:tcW w:type="dxa" w:w="1247"/>
+            <w:shd w:fill="F1F5F9" w:val="clear"/>
+          </w:tcPr>
+          <w:p>
+            <w:r>
+              <w:rPr>
+                <w:sz w:val="18"/>
+              </w:rPr>
+              <w:t>Icons</w:t>
+            </w:r>
+          </w:p>
+        </w:tc>
+        <w:tc>
+          <w:tcPr>
+            <w:tcW w:type="dxa" w:w="1984"/>
+            <w:shd w:fill="F1F5F9" w:val="clear"/>
+          </w:tcPr>
+          <w:p>
+            <w:r>
+              <w:rPr>
+                <w:sz w:val="18"/>
+              </w:rPr>
+              <w:t>Lucide Icons</w:t>
+            </w:r>
+          </w:p>
+        </w:tc>
+        <w:tc>
+          <w:tcPr>
+            <w:tcW w:type="dxa" w:w="1020"/>
+            <w:shd w:fill="F1F5F9" w:val="clear"/>
+          </w:tcPr>
+          <w:p>
+            <w:r>
+              <w:rPr>
+                <w:sz w:val="18"/>
+              </w:rPr>
+              <w:t>(CDN)</w:t>
+            </w:r>
+          </w:p>
+        </w:tc>
+        <w:tc>
+          <w:tcPr>
+            <w:tcW w:type="dxa" w:w="3402"/>
+            <w:shd w:fill="F1F5F9" w:val="clear"/>
+          </w:tcPr>
+          <w:p>
+            <w:r>
+              <w:rPr>
+                <w:sz w:val="18"/>
+              </w:rPr>
+              <w:t>Lightweight icon library for the user interface</w:t>
+            </w:r>
+          </w:p>
+        </w:tc>
+      </w:tr>
+      <w:tr>
+        <w:tc>
+          <w:tcPr>
+            <w:tcW w:type="dxa" w:w="1247"/>
+          </w:tcPr>
+          <w:p>
+            <w:r>
+              <w:rPr>
+                <w:sz w:val="18"/>
+              </w:rPr>
+              <w:t>Authentication</w:t>
+            </w:r>
+          </w:p>
+        </w:tc>
+        <w:tc>
+          <w:tcPr>
+            <w:tcW w:type="dxa" w:w="1984"/>
+          </w:tcPr>
+          <w:p>
+            <w:r>
+              <w:rPr>
+                <w:sz w:val="18"/>
+              </w:rPr>
+              <w:t>Google Identity Services</w:t>
+            </w:r>
+          </w:p>
+        </w:tc>
+        <w:tc>
+          <w:tcPr>
+            <w:tcW w:type="dxa" w:w="1020"/>
+          </w:tcPr>
+          <w:p>
+            <w:r>
+              <w:rPr>
+                <w:sz w:val="18"/>
+              </w:rPr>
+              <w:t>(CDN)</w:t>
+            </w:r>
+          </w:p>
+        </w:tc>
+        <w:tc>
+          <w:tcPr>
+            <w:tcW w:type="dxa" w:w="3402"/>
+          </w:tcPr>
+          <w:p>
+            <w:r>
+              <w:rPr>
+                <w:sz w:val="18"/>
+              </w:rPr>
+              <w:t>OAuth 2.0 popup-based Google sign-in</w:t>
+            </w:r>
+          </w:p>
+        </w:tc>
+      </w:tr>
+      <w:tr>
+        <w:tc>
+          <w:tcPr>
+            <w:tcW w:type="dxa" w:w="1247"/>
+            <w:shd w:fill="F1F5F9" w:val="clear"/>
+          </w:tcPr>
+          <w:p>
+            <w:r>
+              <w:rPr>
+                <w:sz w:val="18"/>
+              </w:rPr>
+              <w:t>Build</w:t>
+            </w:r>
+          </w:p>
+        </w:tc>
+        <w:tc>
+          <w:tcPr>
+            <w:tcW w:type="dxa" w:w="1984"/>
+            <w:shd w:fill="F1F5F9" w:val="clear"/>
+          </w:tcPr>
+          <w:p>
+            <w:r>
+              <w:rPr>
+                <w:sz w:val="18"/>
+              </w:rPr>
+              <w:t>Apache Maven (wrapper)</w:t>
+            </w:r>
+          </w:p>
+        </w:tc>
+        <w:tc>
+          <w:tcPr>
+            <w:tcW w:type="dxa" w:w="1020"/>
+            <w:shd w:fill="F1F5F9" w:val="clear"/>
+          </w:tcPr>
+          <w:p>
+            <w:r>
+              <w:rPr>
+                <w:sz w:val="18"/>
+              </w:rPr>
+              <w:t>3.9.15</w:t>
+            </w:r>
+          </w:p>
+        </w:tc>
+        <w:tc>
+          <w:tcPr>
+            <w:tcW w:type="dxa" w:w="3402"/>
+            <w:shd w:fill="F1F5F9" w:val="clear"/>
+          </w:tcPr>
+          <w:p>
+            <w:r>
+              <w:rPr>
+                <w:sz w:val="18"/>
+              </w:rPr>
+              <w:t>Dependency management, compilation, and executable JAR packaging</w:t>
+            </w:r>
+          </w:p>
+        </w:tc>
+      </w:tr>
+      <w:tr>
+        <w:tc>
+          <w:tcPr>
+            <w:tcW w:type="dxa" w:w="1247"/>
+          </w:tcPr>
+          <w:p>
+            <w:r>
+              <w:rPr>
+                <w:sz w:val="18"/>
+              </w:rPr>
+              <w:t>Runtime</w:t>
+            </w:r>
+          </w:p>
+        </w:tc>
+        <w:tc>
+          <w:tcPr>
+            <w:tcW w:type="dxa" w:w="1984"/>
+          </w:tcPr>
+          <w:p>
+            <w:r>
+              <w:rPr>
+                <w:sz w:val="18"/>
+              </w:rPr>
+              <w:t>Java (OpenJDK Temurin)</w:t>
+            </w:r>
+          </w:p>
+        </w:tc>
+        <w:tc>
+          <w:tcPr>
+            <w:tcW w:type="dxa" w:w="1020"/>
+          </w:tcPr>
+          <w:p>
+            <w:r>
+              <w:rPr>
+                <w:sz w:val="18"/>
+              </w:rPr>
+              <w:t>25.0.2</w:t>
+            </w:r>
+          </w:p>
+        </w:tc>
+        <w:tc>
+          <w:tcPr>
+            <w:tcW w:type="dxa" w:w="3402"/>
+          </w:tcPr>
+          <w:p>
+            <w:r>
+              <w:rPr>
+                <w:sz w:val="18"/>
+              </w:rPr>
+              <w:t>Java runtime environment</w:t>
+            </w:r>
+          </w:p>
+        </w:tc>
+      </w:tr>
+      <w:tr>
+        <w:tc>
+          <w:tcPr>
+            <w:tcW w:type="dxa" w:w="1247"/>
+            <w:shd w:fill="F1F5F9" w:val="clear"/>
+          </w:tcPr>
+          <w:p>
+            <w:r>
+              <w:rPr>
+                <w:sz w:val="18"/>
+              </w:rPr>
+              <w:t>Database Server</w:t>
+            </w:r>
+          </w:p>
+        </w:tc>
+        <w:tc>
+          <w:tcPr>
+            <w:tcW w:type="dxa" w:w="1984"/>
+            <w:shd w:fill="F1F5F9" w:val="clear"/>
+          </w:tcPr>
+          <w:p>
+            <w:r>
+              <w:rPr>
+                <w:sz w:val="18"/>
+              </w:rPr>
+              <w:t>PostgreSQL</w:t>
+            </w:r>
+          </w:p>
+        </w:tc>
+        <w:tc>
+          <w:tcPr>
+            <w:tcW w:type="dxa" w:w="1020"/>
+            <w:shd w:fill="F1F5F9" w:val="clear"/>
+          </w:tcPr>
+          <w:p>
+            <w:r>
+              <w:rPr>
+                <w:sz w:val="18"/>
+              </w:rPr>
+              <w:t>18.3</w:t>
+            </w:r>
+          </w:p>
+        </w:tc>
+        <w:tc>
+          <w:tcPr>
+            <w:tcW w:type="dxa" w:w="3402"/>
+            <w:shd w:fill="F1F5F9" w:val="clear"/>
+          </w:tcPr>
+          <w:p>
+            <w:r>
+              <w:rPr>
+                <w:sz w:val="18"/>
+              </w:rPr>
+              <w:t>Relational database management system</w:t>
+            </w:r>
+          </w:p>
+        </w:tc>
+      </w:tr>
+    </w:tbl>
+    <w:p/>
+    <w:p>
+      <w:r>
+        <w:t>All Java dependencies are managed through the Spring Boot parent POM (version 3.5.14) and Maven wrapper, ensuring consistent version resolution across all four microservices.</w:t>
+      </w:r>
+    </w:p>
+    <w:p>
+      <w:r>
+        <w:br w:type="page"/>
+      </w:r>
+    </w:p>
+    <w:p>
+      <w:pPr>
+        <w:pStyle w:val="Heading1"/>
+      </w:pPr>
+      <w:r>
+        <w:t>13. Implementation Status</w:t>
+      </w:r>
+    </w:p>
+    <w:p>
+      <w:r>
+        <w:t>Each primitive mapped to its implementation and current development status.</w:t>
       </w:r>
     </w:p>
     <w:tbl>
@@ -2863,7 +3828,7 @@
                 <w:color w:val="FFFFFF"/>
                 <w:sz w:val="18"/>
               </w:rPr>
-              <w:t>Database</w:t>
+              <w:t>Database Table</w:t>
             </w:r>
           </w:p>
         </w:tc>
@@ -2959,7 +3924,7 @@
               <w:rPr>
                 <w:sz w:val="18"/>
               </w:rPr>
-              <w:t>AuthService (shared)</w:t>
+              <w:t>AuthService</w:t>
             </w:r>
           </w:p>
         </w:tc>
@@ -3883,39 +4848,7 @@
     <w:p/>
     <w:p>
       <w:r>
-        <w:t>All fourteen primitives are implemented in the SchoolHub codebase. The system uses a microservices architecture with four runtime services (ApiGateway on port 9000, AuthService on 9001, TenantService on 9002, and SchoolService on 9003) connected to a PostgreSQL database with schema-per-tenant isolation. The frontend is a single-page application served through the gateway with role-based rendering for nine user roles.</w:t>
-      </w:r>
-    </w:p>
-    <w:p>
-      <w:pPr>
-        <w:pStyle w:val="Heading2"/>
-      </w:pPr>
-      <w:r>
-        <w:t>Current Development Priorities</w:t>
-      </w:r>
-    </w:p>
-    <w:p>
-      <w:pPr>
-        <w:pStyle w:val="ListBullet"/>
-      </w:pPr>
-      <w:r>
-        <w:t>Stripe payment gateway integration: replacing the simulated payment adapter with live Stripe API calls for online fee payment processing.</w:t>
-      </w:r>
-    </w:p>
-    <w:p>
-      <w:pPr>
-        <w:pStyle w:val="ListBullet"/>
-      </w:pPr>
-      <w:r>
-        <w:t>Template-specific school seeding: populating new tenant schemas with region-appropriate default data based on the template key selected at signup.</w:t>
-      </w:r>
-    </w:p>
-    <w:p>
-      <w:pPr>
-        <w:pStyle w:val="ListBullet"/>
-      </w:pPr>
-      <w:r>
-        <w:t>Self-service password recovery: enabling users to reset their passwords through email verification without administrator intervention.</w:t>
+        <w:t>All fourteen primitives are implemented. The system uses a microservices architecture with four services (Gateway:9000, Auth:9001, Tenant:9002, School:9003) connected to PostgreSQL with schema-per-tenant isolation.</w:t>
       </w:r>
     </w:p>
     <w:p>
@@ -3928,27 +4861,27 @@
         <w:pStyle w:val="Heading1"/>
       </w:pPr>
       <w:r>
-        <w:t>13. Conclusion</w:t>
+        <w:t>14. Conclusion</w:t>
       </w:r>
     </w:p>
     <w:p>
       <w:r>
-        <w:t>Every learning institution can be described with fourteen universal concepts. The differences between them are in the labels they apply and the rules they enforce, not in the underlying data structures. By modelling the abstraction and treating the label as configuration data, a single software system can serve multiple institution types without code changes.</w:t>
+        <w:t>Every learning institution can be described with fourteen universal concepts. The differences are in the labels and the rules, not in the underlying data structures. By modelling the abstraction and treating the label as configuration data, a single system can serve multiple institution types.</w:t>
       </w:r>
     </w:p>
     <w:p>
       <w:r>
-        <w:t>Three primitives determine whether a system is genuinely configurable. Role must be a relationship, not a fixed entity type. Enrollment must be an independent entity with its own lifecycle, not a column on a student record. Schedule must support self-referential nesting rather than a fixed number of levels. Getting these three right is the difference between a single-school application and a platform.</w:t>
+        <w:t>Three primitives determine whether a system is genuinely configurable: Role must be a relationship, Enrollment must be an independent entity, and Schedule must support self-referential nesting. Getting these right distinguishes a platform from a single-school application.</w:t>
       </w:r>
     </w:p>
     <w:p>
       <w:r>
-        <w:t>Scope discipline is essential. Attempting to support every type of learning institution simultaneously leads to combinatorial complexity that exceeds the scope of a single project. Scoping deliberately to K-12 private schools and vocational institutes is achievable, defensible, and honest.</w:t>
+        <w:t>Scope discipline is essential. Scoping deliberately to K-12 private schools and vocational institutes is achievable, defensible, and honest.</w:t>
       </w:r>
     </w:p>
     <w:p>
       <w:r>
-        <w:t>The SchoolHub implementation demonstrates all fourteen primitives in working code, with twelve of fifteen planned features complete and the remainder actively in development. The system serves as proof that the design vocabulary presented in this document is not merely theoretical but practical, implementable, and functional.</w:t>
+        <w:t>The SchoolHub implementation demonstrates all fourteen primitives in working code, with twelve of fifteen planned features complete and the remainder actively in development.</w:t>
       </w:r>
     </w:p>
     <w:p>
@@ -3962,11 +4895,6 @@
       </w:pPr>
       <w:r>
         <w:t>Appendix A: MoSCoW Decision Matrix</w:t>
-      </w:r>
-    </w:p>
-    <w:p>
-      <w:r>
-        <w:t>The following matrix records the prioritisation decisions made during the design phase and their current implementation status.</w:t>
       </w:r>
     </w:p>
     <w:tbl>
@@ -4893,7 +5821,7 @@
     <w:p/>
     <w:p>
       <w:r>
-        <w:t>All Must and Should priority items are implemented and verified. The Could items are genuine features deferred to future development cycles. The Will Not items define the scope boundary: these are the institution types deliberately excluded to keep the project achievable and defensible.</w:t>
+        <w:t>All Must and Should items are implemented and verified. Could items are deferred to future cycles. Will Not items define the scope boundary.</w:t>
       </w:r>
     </w:p>
     <w:p>
@@ -4911,7 +5839,7 @@
     </w:p>
     <w:p>
       <w:r>
-        <w:t>The SchoolHub database uses schema-per-tenant isolation. The platform schema contains shared registry and authentication tables. Each school receives its own PostgreSQL schema created at signup, populated from a template file.</w:t>
+        <w:t>Schema-per-tenant isolation: the platform schema contains shared registry and authentication tables. Each school receives its own PostgreSQL schema created at signup.</w:t>
       </w:r>
     </w:p>
     <w:p>
@@ -4919,7 +5847,7 @@
         <w:pStyle w:val="Heading2"/>
       </w:pPr>
       <w:r>
-        <w:t>Platform Schema (shared across all tenants)</w:t>
+        <w:t>Platform Schema</w:t>
       </w:r>
     </w:p>
     <w:p>
@@ -4927,7 +5855,7 @@
         <w:pStyle w:val="ListBullet"/>
       </w:pPr>
       <w:r>
-        <w:t>platform.role: The nine system roles with identifiers and descriptions.</w:t>
+        <w:t>platform.role — Nine system roles</w:t>
       </w:r>
     </w:p>
     <w:p>
@@ -4935,7 +5863,7 @@
         <w:pStyle w:val="ListBullet"/>
       </w:pPr>
       <w:r>
-        <w:t>platform.subscription_plan: Pricing tiers that schools select at registration.</w:t>
+        <w:t>platform.subscription_plan — Pricing tiers</w:t>
       </w:r>
     </w:p>
     <w:p>
@@ -4943,7 +5871,7 @@
         <w:pStyle w:val="ListBullet"/>
       </w:pPr>
       <w:r>
-        <w:t>platform.tenant: The registry of all schools with their schema names, status, and configuration.</w:t>
+        <w:t>platform.tenant — School registry</w:t>
       </w:r>
     </w:p>
     <w:p>
@@ -4951,7 +5879,7 @@
         <w:pStyle w:val="ListBullet"/>
       </w:pPr>
       <w:r>
-        <w:t>platform.app_user: The single user table for the entire platform with cross-tenant identity.</w:t>
+        <w:t>platform.app_user — Single user table</w:t>
       </w:r>
     </w:p>
     <w:p>
@@ -4959,7 +5887,7 @@
         <w:pStyle w:val="ListBullet"/>
       </w:pPr>
       <w:r>
-        <w:t>platform.role_assignment: Maps users to roles within specific tenants, with default assignment flags.</w:t>
+        <w:t>platform.role_assignment — User-to-role mappings</w:t>
       </w:r>
     </w:p>
     <w:p>
@@ -4967,7 +5895,7 @@
         <w:pStyle w:val="ListBullet"/>
       </w:pPr>
       <w:r>
-        <w:t>platform.token_blacklist: Invalidated refresh tokens for logout enforcement.</w:t>
+        <w:t>platform.token_blacklist — Logout enforcement</w:t>
       </w:r>
     </w:p>
     <w:p>
@@ -4975,7 +5903,7 @@
         <w:pStyle w:val="ListBullet"/>
       </w:pPr>
       <w:r>
-        <w:t>platform.audit_log: Cross-service audit trail of significant actions.</w:t>
+        <w:t>platform.audit_log — Cross-service audit trail</w:t>
       </w:r>
     </w:p>
     <w:p>
@@ -4983,7 +5911,7 @@
         <w:pStyle w:val="ListBullet"/>
       </w:pPr>
       <w:r>
-        <w:t>platform.notification: User notification inbox spanning multiple tenants.</w:t>
+        <w:t>platform.notification — User inbox</w:t>
       </w:r>
     </w:p>
     <w:p>
@@ -4991,7 +5919,7 @@
         <w:pStyle w:val="ListBullet"/>
       </w:pPr>
       <w:r>
-        <w:t>platform.workflow_request and workflow_protest: Generalised propose-confirm-protest governance system.</w:t>
+        <w:t>platform.workflow_request / workflow_protest — Governance</w:t>
       </w:r>
     </w:p>
     <w:p>
@@ -4999,7 +5927,7 @@
         <w:pStyle w:val="ListBullet"/>
       </w:pPr>
       <w:r>
-        <w:t>platform.invite and invite_redemption: Code-based and direct invitations for class joins and guardian linking.</w:t>
+        <w:t>platform.invite / invite_redemption — Invitations</w:t>
       </w:r>
     </w:p>
     <w:p>
@@ -5007,7 +5935,7 @@
         <w:pStyle w:val="Heading2"/>
       </w:pPr>
       <w:r>
-        <w:t>Tenant Schema (per-school, isolated)</w:t>
+        <w:t>Tenant Schema (per-school)</w:t>
       </w:r>
     </w:p>
     <w:p>
@@ -5015,7 +5943,7 @@
         <w:pStyle w:val="ListBullet"/>
       </w:pPr>
       <w:r>
-        <w:t>Core academic: teacher, subject, school_class, class_subject, student, guardian, student_guardian.</w:t>
+        <w:t>teacher, subject, school_class, class_subject, student, guardian, student_guardian</w:t>
       </w:r>
     </w:p>
     <w:p>
@@ -5023,7 +5951,7 @@
         <w:pStyle w:val="ListBullet"/>
       </w:pPr>
       <w:r>
-        <w:t>Assessment: assessment, result.</w:t>
+        <w:t>assessment, result</w:t>
       </w:r>
     </w:p>
     <w:p>
@@ -5031,7 +5959,7 @@
         <w:pStyle w:val="ListBullet"/>
       </w:pPr>
       <w:r>
-        <w:t>Attendance: attendance (daily) and session_attendance (per-session).</w:t>
+        <w:t>attendance (daily), session_attendance (per-session)</w:t>
       </w:r>
     </w:p>
     <w:p>
@@ -5039,7 +5967,7 @@
         <w:pStyle w:val="ListBullet"/>
       </w:pPr>
       <w:r>
-        <w:t>Calendar: calendar_event.</w:t>
+        <w:t>calendar_event</w:t>
       </w:r>
     </w:p>
     <w:p>
@@ -5047,7 +5975,7 @@
         <w:pStyle w:val="ListBullet"/>
       </w:pPr>
       <w:r>
-        <w:t>Financial: fee_invoice, fee_payment, fee_waiver, scholarship_rule, financial_settings, fee_category.</w:t>
+        <w:t>fee_invoice, fee_payment, fee_waiver, scholarship_rule, financial_settings, fee_category</w:t>
       </w:r>
     </w:p>
     <w:p>
@@ -5055,7 +5983,7 @@
         <w:pStyle w:val="ListBullet"/>
       </w:pPr>
       <w:r>
-        <w:t>New-model academic: cohort, group, cohort_offering, enrollment, org_unit, offering, offering_org_unit, offering_prerequisite.</w:t>
+        <w:t>cohort, group, cohort_offering, enrollment</w:t>
       </w:r>
     </w:p>
     <w:p>
@@ -5063,7 +5991,7 @@
         <w:pStyle w:val="ListBullet"/>
       </w:pPr>
       <w:r>
-        <w:t>Scheduling: schedule_period, session, resource, resource_permit.</w:t>
+        <w:t>org_unit, offering, offering_org_unit, offering_prerequisite</w:t>
       </w:r>
     </w:p>
     <w:p>
@@ -5071,7 +5999,7 @@
         <w:pStyle w:val="ListBullet"/>
       </w:pPr>
       <w:r>
-        <w:t>Governance: progression_rule, progression_result, credential.</w:t>
+        <w:t>schedule_period, session, resource, resource_permit</w:t>
       </w:r>
     </w:p>
     <w:p>
@@ -5079,7 +6007,15 @@
         <w:pStyle w:val="ListBullet"/>
       </w:pPr>
       <w:r>
-        <w:t>Library: library_staff, library_student, book, borrow_request, borrow_record, book_flag, library_fine_rule.</w:t>
+        <w:t>progression_rule, progression_result, credential</w:t>
+      </w:r>
+    </w:p>
+    <w:p>
+      <w:pPr>
+        <w:pStyle w:val="ListBullet"/>
+      </w:pPr>
+      <w:r>
+        <w:t>library_staff, library_student, book, borrow_request, borrow_record, book_flag, library_fine_rule</w:t>
       </w:r>
     </w:p>
     <w:sectPr>

</xml_diff>